<commit_message>
added cart count and shipping address
</commit_message>
<xml_diff>
--- a/doc/Changes.docx
+++ b/doc/Changes.docx
@@ -45,8 +45,14 @@
     <w:p>
       <w:pPr>
         <w:ind w:left="720"/>
-      </w:pPr>
-      <w:r>
+        <w:rPr>
+          <w:strike/>
+        </w:rPr>
+      </w:pPr>
+      <w:r>
+        <w:rPr>
+          <w:strike/>
+        </w:rPr>
         <w:t xml:space="preserve">Hide the category filter. when click filter then show all the category with checkbox to select. </w:t>
       </w:r>
     </w:p>
@@ -179,8 +185,14 @@
     <w:p>
       <w:pPr>
         <w:pStyle w:val="ListParagraph"/>
-      </w:pPr>
-      <w:r>
+        <w:rPr>
+          <w:strike/>
+        </w:rPr>
+      </w:pPr>
+      <w:r>
+        <w:rPr>
+          <w:strike/>
+        </w:rPr>
         <w:t>Show image bigger and navigate for more than one image.</w:t>
       </w:r>
     </w:p>
@@ -306,8 +318,14 @@
     <w:p>
       <w:pPr>
         <w:pStyle w:val="ListParagraph"/>
-      </w:pPr>
-      <w:r>
+        <w:rPr>
+          <w:strike/>
+        </w:rPr>
+      </w:pPr>
+      <w:r>
+        <w:rPr>
+          <w:strike/>
+        </w:rPr>
         <w:t>Display default shipping address</w:t>
       </w:r>
     </w:p>
@@ -339,16 +357,28 @@
     <w:p>
       <w:pPr>
         <w:pStyle w:val="ListParagraph"/>
-      </w:pPr>
-      <w:r>
+        <w:rPr>
+          <w:strike/>
+        </w:rPr>
+      </w:pPr>
+      <w:r>
+        <w:rPr>
+          <w:strike/>
+        </w:rPr>
         <w:t>New window to show logged on user profile</w:t>
       </w:r>
     </w:p>
     <w:p>
       <w:pPr>
         <w:pStyle w:val="ListParagraph"/>
-      </w:pPr>
-      <w:r>
+        <w:rPr>
+          <w:strike/>
+        </w:rPr>
+      </w:pPr>
+      <w:r>
+        <w:rPr>
+          <w:strike/>
+        </w:rPr>
         <w:t>Allow to change password</w:t>
       </w:r>
     </w:p>
@@ -453,8 +483,14 @@
           <w:ilvl w:val="1"/>
           <w:numId w:val="2"/>
         </w:numPr>
-      </w:pPr>
-      <w:r>
+        <w:rPr>
+          <w:strike/>
+        </w:rPr>
+      </w:pPr>
+      <w:r>
+        <w:rPr>
+          <w:strike/>
+        </w:rPr>
         <w:t>activate / deactivate</w:t>
       </w:r>
     </w:p>
@@ -465,8 +501,14 @@
           <w:ilvl w:val="1"/>
           <w:numId w:val="2"/>
         </w:numPr>
-      </w:pPr>
-      <w:r>
+        <w:rPr>
+          <w:strike/>
+        </w:rPr>
+      </w:pPr>
+      <w:r>
+        <w:rPr>
+          <w:strike/>
+        </w:rPr>
         <w:t>password reset</w:t>
       </w:r>
     </w:p>

</xml_diff>